<commit_message>
Updated standup notes to include our kanban snapshots
</commit_message>
<xml_diff>
--- a/Docs/team-5/Daily Standup Notes.docx
+++ b/Docs/team-5/Daily Standup Notes.docx
@@ -107,21 +107,7 @@
         <w:rPr>
           <w:lang w:val="en-US"/>
         </w:rPr>
-        <w:t xml:space="preserve">Met the </w:t>
-      </w:r>
-      <w:proofErr w:type="spellStart"/>
-      <w:r>
-        <w:rPr>
-          <w:lang w:val="en-US"/>
-        </w:rPr>
-        <w:t>iDaVie</w:t>
-      </w:r>
-      <w:proofErr w:type="spellEnd"/>
-      <w:r>
-        <w:rPr>
-          <w:lang w:val="en-US"/>
-        </w:rPr>
-        <w:t xml:space="preserve"> team and read the brief</w:t>
+        <w:t>Met the iDaVie team and read the brief</w:t>
       </w:r>
     </w:p>
     <w:p>
@@ -325,21 +311,7 @@
         <w:rPr>
           <w:lang w:val="en-US"/>
         </w:rPr>
-        <w:t xml:space="preserve">Set up </w:t>
-      </w:r>
-      <w:proofErr w:type="spellStart"/>
-      <w:r>
-        <w:rPr>
-          <w:lang w:val="en-US"/>
-        </w:rPr>
-        <w:t>github</w:t>
-      </w:r>
-      <w:proofErr w:type="spellEnd"/>
-      <w:r>
-        <w:rPr>
-          <w:lang w:val="en-US"/>
-        </w:rPr>
-        <w:t xml:space="preserve"> branch</w:t>
+        <w:t>Set up github branch</w:t>
       </w:r>
     </w:p>
     <w:p>
@@ -517,21 +489,7 @@
         <w:rPr>
           <w:lang w:val="en-US"/>
         </w:rPr>
-        <w:t xml:space="preserve">Began planning for splitting </w:t>
-      </w:r>
-      <w:proofErr w:type="spellStart"/>
-      <w:r>
-        <w:rPr>
-          <w:lang w:val="en-US"/>
-        </w:rPr>
-        <w:t>FeatureSetManager</w:t>
-      </w:r>
-      <w:proofErr w:type="spellEnd"/>
-      <w:r>
-        <w:rPr>
-          <w:lang w:val="en-US"/>
-        </w:rPr>
-        <w:t xml:space="preserve"> into 3 separate classes</w:t>
+        <w:t>Began planning for splitting FeatureSetManager into 3 separate classes</w:t>
       </w:r>
     </w:p>
     <w:p>
@@ -638,16 +596,8 @@
         <w:rPr>
           <w:lang w:val="en-US"/>
         </w:rPr>
-        <w:t xml:space="preserve">Mark – </w:t>
-      </w:r>
-      <w:proofErr w:type="spellStart"/>
-      <w:r>
-        <w:rPr>
-          <w:lang w:val="en-US"/>
-        </w:rPr>
-        <w:t>scrummaster</w:t>
-      </w:r>
-      <w:proofErr w:type="spellEnd"/>
+        <w:t>Mark – scrummaster</w:t>
+      </w:r>
     </w:p>
     <w:p>
       <w:pPr>
@@ -718,21 +668,7 @@
         <w:rPr>
           <w:lang w:val="en-US"/>
         </w:rPr>
-        <w:t xml:space="preserve">Split </w:t>
-      </w:r>
-      <w:proofErr w:type="spellStart"/>
-      <w:r>
-        <w:rPr>
-          <w:lang w:val="en-US"/>
-        </w:rPr>
-        <w:t>FeatureSetManager</w:t>
-      </w:r>
-      <w:proofErr w:type="spellEnd"/>
-      <w:r>
-        <w:rPr>
-          <w:lang w:val="en-US"/>
-        </w:rPr>
-        <w:t xml:space="preserve"> god class into 3 separate sub classes</w:t>
+        <w:t>Split FeatureSetManager god class into 3 separate sub classes</w:t>
       </w:r>
     </w:p>
     <w:p>
@@ -768,21 +704,7 @@
         <w:rPr>
           <w:lang w:val="en-US"/>
         </w:rPr>
-        <w:t xml:space="preserve">Researched GRASP and </w:t>
-      </w:r>
-      <w:proofErr w:type="spellStart"/>
-      <w:r>
-        <w:rPr>
-          <w:lang w:val="en-US"/>
-        </w:rPr>
-        <w:t>Liskov</w:t>
-      </w:r>
-      <w:proofErr w:type="spellEnd"/>
-      <w:r>
-        <w:rPr>
-          <w:lang w:val="en-US"/>
-        </w:rPr>
-        <w:t xml:space="preserve"> Principles</w:t>
+        <w:t>Researched GRASP and Liskov Principles</w:t>
       </w:r>
     </w:p>
     <w:p>
@@ -844,16 +766,8 @@
         <w:rPr>
           <w:lang w:val="en-US"/>
         </w:rPr>
-        <w:t xml:space="preserve">Removed all dependencies on </w:t>
-      </w:r>
-      <w:proofErr w:type="spellStart"/>
-      <w:r>
-        <w:rPr>
-          <w:lang w:val="en-US"/>
-        </w:rPr>
-        <w:t>FeatureSetManager</w:t>
-      </w:r>
-      <w:proofErr w:type="spellEnd"/>
+        <w:t>Removed all dependencies on FeatureSetManager</w:t>
+      </w:r>
     </w:p>
     <w:p>
       <w:pPr>
@@ -914,16 +828,8 @@
         <w:rPr>
           <w:lang w:val="en-US"/>
         </w:rPr>
-        <w:t xml:space="preserve">Removed </w:t>
-      </w:r>
-      <w:proofErr w:type="spellStart"/>
-      <w:r>
-        <w:rPr>
-          <w:lang w:val="en-US"/>
-        </w:rPr>
-        <w:t>FeatureSetManager</w:t>
-      </w:r>
-      <w:proofErr w:type="spellEnd"/>
+        <w:t>Removed FeatureSetManager</w:t>
+      </w:r>
     </w:p>
     <w:p>
       <w:pPr>
@@ -940,30 +846,8 @@
         <w:rPr>
           <w:lang w:val="en-US"/>
         </w:rPr>
-        <w:t xml:space="preserve">Replaced </w:t>
-      </w:r>
-      <w:proofErr w:type="spellStart"/>
-      <w:r>
-        <w:rPr>
-          <w:lang w:val="en-US"/>
-        </w:rPr>
-        <w:t>FeatureSetManagerEditor</w:t>
-      </w:r>
-      <w:proofErr w:type="spellEnd"/>
-      <w:r>
-        <w:rPr>
-          <w:lang w:val="en-US"/>
-        </w:rPr>
-        <w:t xml:space="preserve"> with </w:t>
-      </w:r>
-      <w:proofErr w:type="spellStart"/>
-      <w:r>
-        <w:rPr>
-          <w:lang w:val="en-US"/>
-        </w:rPr>
-        <w:t>FeatureSetEditor</w:t>
-      </w:r>
-      <w:proofErr w:type="spellEnd"/>
+        <w:t>Replaced FeatureSetManagerEditor with FeatureSetEditor</w:t>
+      </w:r>
     </w:p>
     <w:p>
       <w:pPr>
@@ -980,21 +864,7 @@
         <w:rPr>
           <w:lang w:val="en-US"/>
         </w:rPr>
-        <w:t xml:space="preserve">Updated UML diagram post </w:t>
-      </w:r>
-      <w:proofErr w:type="spellStart"/>
-      <w:r>
-        <w:rPr>
-          <w:lang w:val="en-US"/>
-        </w:rPr>
-        <w:t>FeatureSetManager</w:t>
-      </w:r>
-      <w:proofErr w:type="spellEnd"/>
-      <w:r>
-        <w:rPr>
-          <w:lang w:val="en-US"/>
-        </w:rPr>
-        <w:t xml:space="preserve"> removal</w:t>
+        <w:t>Updated UML diagram post FeatureSetManager removal</w:t>
       </w:r>
     </w:p>
     <w:p>
@@ -1074,21 +944,7 @@
         <w:rPr>
           <w:lang w:val="en-US"/>
         </w:rPr>
-        <w:t xml:space="preserve">Created </w:t>
-      </w:r>
-      <w:proofErr w:type="spellStart"/>
-      <w:r>
-        <w:rPr>
-          <w:lang w:val="en-US"/>
-        </w:rPr>
-        <w:t>IFeature</w:t>
-      </w:r>
-      <w:proofErr w:type="spellEnd"/>
-      <w:r>
-        <w:rPr>
-          <w:lang w:val="en-US"/>
-        </w:rPr>
-        <w:t xml:space="preserve"> – our required interface</w:t>
+        <w:t>Created IFeature – our required interface</w:t>
       </w:r>
     </w:p>
     <w:p>
@@ -1150,21 +1006,7 @@
         <w:rPr>
           <w:lang w:val="en-US"/>
         </w:rPr>
-        <w:t xml:space="preserve">Finished </w:t>
-      </w:r>
-      <w:proofErr w:type="spellStart"/>
-      <w:r>
-        <w:rPr>
-          <w:lang w:val="en-US"/>
-        </w:rPr>
-        <w:t>VOTable</w:t>
-      </w:r>
-      <w:proofErr w:type="spellEnd"/>
-      <w:r>
-        <w:rPr>
-          <w:lang w:val="en-US"/>
-        </w:rPr>
-        <w:t xml:space="preserve"> export refactoring example</w:t>
+        <w:t>Finished VOTable export refactoring example</w:t>
       </w:r>
     </w:p>
     <w:p>
@@ -1439,19 +1281,11 @@
           <w:lang w:val="en-US"/>
         </w:rPr>
       </w:pPr>
-      <w:proofErr w:type="spellStart"/>
-      <w:r>
-        <w:rPr>
-          <w:lang w:val="en-US"/>
-        </w:rPr>
-        <w:t>Finalised</w:t>
-      </w:r>
-      <w:proofErr w:type="spellEnd"/>
-      <w:r>
-        <w:rPr>
-          <w:lang w:val="en-US"/>
-        </w:rPr>
-        <w:t xml:space="preserve"> CK metrics for before and after</w:t>
+      <w:r>
+        <w:rPr>
+          <w:lang w:val="en-US"/>
+        </w:rPr>
+        <w:t>Finalised CK metrics for before and after</w:t>
       </w:r>
     </w:p>
     <w:p>
@@ -1465,19 +1299,11 @@
           <w:lang w:val="en-US"/>
         </w:rPr>
       </w:pPr>
-      <w:proofErr w:type="spellStart"/>
-      <w:r>
-        <w:rPr>
-          <w:lang w:val="en-US"/>
-        </w:rPr>
-        <w:t>Finalised</w:t>
-      </w:r>
-      <w:proofErr w:type="spellEnd"/>
-      <w:r>
-        <w:rPr>
-          <w:lang w:val="en-US"/>
-        </w:rPr>
-        <w:t xml:space="preserve"> refactored examples</w:t>
+      <w:r>
+        <w:rPr>
+          <w:lang w:val="en-US"/>
+        </w:rPr>
+        <w:t>Finalised refactored examples</w:t>
       </w:r>
     </w:p>
     <w:p>
@@ -1514,6 +1340,316 @@
           <w:lang w:val="en-US"/>
         </w:rPr>
         <w:t xml:space="preserve">Merged with main </w:t>
+      </w:r>
+    </w:p>
+    <w:p>
+      <w:pPr>
+        <w:rPr>
+          <w:lang w:val="en-US"/>
+        </w:rPr>
+      </w:pPr>
+    </w:p>
+    <w:p>
+      <w:pPr>
+        <w:rPr>
+          <w:lang w:val="en-US"/>
+        </w:rPr>
+      </w:pPr>
+    </w:p>
+    <w:p>
+      <w:pPr>
+        <w:rPr>
+          <w:lang w:val="en-US"/>
+        </w:rPr>
+      </w:pPr>
+    </w:p>
+    <w:p>
+      <w:pPr>
+        <w:rPr>
+          <w:lang w:val="en-US"/>
+        </w:rPr>
+      </w:pPr>
+    </w:p>
+    <w:p>
+      <w:pPr>
+        <w:rPr>
+          <w:lang w:val="en-US"/>
+        </w:rPr>
+      </w:pPr>
+    </w:p>
+    <w:p>
+      <w:pPr>
+        <w:rPr>
+          <w:lang w:val="en-US"/>
+        </w:rPr>
+      </w:pPr>
+    </w:p>
+    <w:p>
+      <w:pPr>
+        <w:rPr>
+          <w:lang w:val="en-US"/>
+        </w:rPr>
+      </w:pPr>
+    </w:p>
+    <w:p>
+      <w:pPr>
+        <w:rPr>
+          <w:lang w:val="en-US"/>
+        </w:rPr>
+      </w:pPr>
+    </w:p>
+    <w:p>
+      <w:pPr>
+        <w:rPr>
+          <w:lang w:val="en-US"/>
+        </w:rPr>
+      </w:pPr>
+    </w:p>
+    <w:p>
+      <w:pPr>
+        <w:rPr>
+          <w:lang w:val="en-US"/>
+        </w:rPr>
+      </w:pPr>
+    </w:p>
+    <w:p>
+      <w:pPr>
+        <w:rPr>
+          <w:lang w:val="en-US"/>
+        </w:rPr>
+      </w:pPr>
+    </w:p>
+    <w:p>
+      <w:pPr>
+        <w:rPr>
+          <w:lang w:val="en-US"/>
+        </w:rPr>
+      </w:pPr>
+    </w:p>
+    <w:p>
+      <w:pPr>
+        <w:rPr>
+          <w:lang w:val="en-US"/>
+        </w:rPr>
+      </w:pPr>
+    </w:p>
+    <w:p>
+      <w:pPr>
+        <w:rPr>
+          <w:lang w:val="en-US"/>
+        </w:rPr>
+      </w:pPr>
+    </w:p>
+    <w:p>
+      <w:pPr>
+        <w:pBdr>
+          <w:bottom w:val="single" w:sz="12" w:space="1" w:color="auto"/>
+        </w:pBdr>
+        <w:rPr>
+          <w:lang w:val="en-US"/>
+        </w:rPr>
+      </w:pPr>
+      <w:r>
+        <w:rPr>
+          <w:lang w:val="en-US"/>
+        </w:rPr>
+        <w:lastRenderedPageBreak/>
+        <w:t>Mid-Week Kanban Snapshots</w:t>
+      </w:r>
+    </w:p>
+    <w:p>
+      <w:pPr>
+        <w:rPr>
+          <w:lang w:val="en-US"/>
+        </w:rPr>
+      </w:pPr>
+    </w:p>
+    <w:p>
+      <w:pPr>
+        <w:rPr>
+          <w:lang w:val="en-US"/>
+        </w:rPr>
+      </w:pPr>
+      <w:r>
+        <w:rPr>
+          <w:lang w:val="en-US"/>
+        </w:rPr>
+        <w:t>Week 1</w:t>
+      </w:r>
+    </w:p>
+    <w:p>
+      <w:pPr>
+        <w:rPr>
+          <w:lang w:val="en-US"/>
+        </w:rPr>
+      </w:pPr>
+      <w:r>
+        <w:rPr>
+          <w:lang w:val="en-US"/>
+        </w:rPr>
+        <w:drawing>
+          <wp:inline distT="0" distB="0" distL="0" distR="0" wp14:anchorId="6908B90E" wp14:editId="6912AF1D">
+            <wp:extent cx="4467225" cy="3150220"/>
+            <wp:effectExtent l="0" t="0" r="0" b="0"/>
+            <wp:docPr id="1381056719" name="Picture 1"/>
+            <wp:cNvGraphicFramePr>
+              <a:graphicFrameLocks xmlns:a="http://schemas.openxmlformats.org/drawingml/2006/main" noChangeAspect="1"/>
+            </wp:cNvGraphicFramePr>
+            <a:graphic xmlns:a="http://schemas.openxmlformats.org/drawingml/2006/main">
+              <a:graphicData uri="http://schemas.openxmlformats.org/drawingml/2006/picture">
+                <pic:pic xmlns:pic="http://schemas.openxmlformats.org/drawingml/2006/picture">
+                  <pic:nvPicPr>
+                    <pic:cNvPr id="1381056719" name=""/>
+                    <pic:cNvPicPr/>
+                  </pic:nvPicPr>
+                  <pic:blipFill>
+                    <a:blip r:embed="rId5"/>
+                    <a:stretch>
+                      <a:fillRect/>
+                    </a:stretch>
+                  </pic:blipFill>
+                  <pic:spPr>
+                    <a:xfrm>
+                      <a:off x="0" y="0"/>
+                      <a:ext cx="4485951" cy="3163426"/>
+                    </a:xfrm>
+                    <a:prstGeom prst="rect">
+                      <a:avLst/>
+                    </a:prstGeom>
+                  </pic:spPr>
+                </pic:pic>
+              </a:graphicData>
+            </a:graphic>
+          </wp:inline>
+        </w:drawing>
+      </w:r>
+    </w:p>
+    <w:p>
+      <w:pPr>
+        <w:rPr>
+          <w:lang w:val="en-US"/>
+        </w:rPr>
+      </w:pPr>
+    </w:p>
+    <w:p>
+      <w:pPr>
+        <w:rPr>
+          <w:lang w:val="en-US"/>
+        </w:rPr>
+      </w:pPr>
+      <w:r>
+        <w:rPr>
+          <w:lang w:val="en-US"/>
+        </w:rPr>
+        <w:t>Week 2</w:t>
+      </w:r>
+    </w:p>
+    <w:p>
+      <w:pPr>
+        <w:rPr>
+          <w:lang w:val="en-US"/>
+        </w:rPr>
+      </w:pPr>
+      <w:r>
+        <w:rPr>
+          <w:lang w:val="en-US"/>
+        </w:rPr>
+        <w:drawing>
+          <wp:inline distT="0" distB="0" distL="0" distR="0" wp14:anchorId="644E94D4" wp14:editId="4E884875">
+            <wp:extent cx="4358109" cy="3943350"/>
+            <wp:effectExtent l="0" t="0" r="4445" b="0"/>
+            <wp:docPr id="1703581533" name="Picture 1"/>
+            <wp:cNvGraphicFramePr>
+              <a:graphicFrameLocks xmlns:a="http://schemas.openxmlformats.org/drawingml/2006/main" noChangeAspect="1"/>
+            </wp:cNvGraphicFramePr>
+            <a:graphic xmlns:a="http://schemas.openxmlformats.org/drawingml/2006/main">
+              <a:graphicData uri="http://schemas.openxmlformats.org/drawingml/2006/picture">
+                <pic:pic xmlns:pic="http://schemas.openxmlformats.org/drawingml/2006/picture">
+                  <pic:nvPicPr>
+                    <pic:cNvPr id="1703581533" name=""/>
+                    <pic:cNvPicPr/>
+                  </pic:nvPicPr>
+                  <pic:blipFill>
+                    <a:blip r:embed="rId6"/>
+                    <a:stretch>
+                      <a:fillRect/>
+                    </a:stretch>
+                  </pic:blipFill>
+                  <pic:spPr>
+                    <a:xfrm>
+                      <a:off x="0" y="0"/>
+                      <a:ext cx="4380313" cy="3963440"/>
+                    </a:xfrm>
+                    <a:prstGeom prst="rect">
+                      <a:avLst/>
+                    </a:prstGeom>
+                  </pic:spPr>
+                </pic:pic>
+              </a:graphicData>
+            </a:graphic>
+          </wp:inline>
+        </w:drawing>
+      </w:r>
+    </w:p>
+    <w:p>
+      <w:pPr>
+        <w:rPr>
+          <w:lang w:val="en-US"/>
+        </w:rPr>
+      </w:pPr>
+      <w:r>
+        <w:rPr>
+          <w:lang w:val="en-US"/>
+        </w:rPr>
+        <w:lastRenderedPageBreak/>
+        <w:t>Week 3</w:t>
+      </w:r>
+    </w:p>
+    <w:p>
+      <w:pPr>
+        <w:rPr>
+          <w:lang w:val="en-US"/>
+        </w:rPr>
+      </w:pPr>
+      <w:r>
+        <w:rPr>
+          <w:lang w:val="en-US"/>
+        </w:rPr>
+        <w:drawing>
+          <wp:inline distT="0" distB="0" distL="0" distR="0" wp14:anchorId="3E794A12" wp14:editId="6B7D8696">
+            <wp:extent cx="5731510" cy="3032760"/>
+            <wp:effectExtent l="0" t="0" r="2540" b="0"/>
+            <wp:docPr id="1877399687" name="Picture 1"/>
+            <wp:cNvGraphicFramePr>
+              <a:graphicFrameLocks xmlns:a="http://schemas.openxmlformats.org/drawingml/2006/main" noChangeAspect="1"/>
+            </wp:cNvGraphicFramePr>
+            <a:graphic xmlns:a="http://schemas.openxmlformats.org/drawingml/2006/main">
+              <a:graphicData uri="http://schemas.openxmlformats.org/drawingml/2006/picture">
+                <pic:pic xmlns:pic="http://schemas.openxmlformats.org/drawingml/2006/picture">
+                  <pic:nvPicPr>
+                    <pic:cNvPr id="1877399687" name=""/>
+                    <pic:cNvPicPr/>
+                  </pic:nvPicPr>
+                  <pic:blipFill>
+                    <a:blip r:embed="rId7"/>
+                    <a:stretch>
+                      <a:fillRect/>
+                    </a:stretch>
+                  </pic:blipFill>
+                  <pic:spPr>
+                    <a:xfrm>
+                      <a:off x="0" y="0"/>
+                      <a:ext cx="5731510" cy="3032760"/>
+                    </a:xfrm>
+                    <a:prstGeom prst="rect">
+                      <a:avLst/>
+                    </a:prstGeom>
+                  </pic:spPr>
+                </pic:pic>
+              </a:graphicData>
+            </a:graphic>
+          </wp:inline>
+        </w:drawing>
       </w:r>
     </w:p>
     <w:sectPr>

</xml_diff>